<commit_message>
CapNhat README.md Tong (Tottal)
</commit_message>
<xml_diff>
--- a/LAB_AT_OOSD/LAB04/Word/PhamMinhGiang-12DHCNPM1-Lab04.docx
+++ b/LAB_AT_OOSD/LAB04/Word/PhamMinhGiang-12DHCNPM1-Lab04.docx
@@ -3464,204 +3464,23 @@
     </w:p>
     <w:p>
       <w:r>
-        <w:t>2.3. Mô hình lớp phân tích</w:t>
-      </w:r>
-    </w:p>
-    <w:p>
-      <w:r>
-        <w:t>Mô hình lớp phân tích được xây dựng theo ba nhóm lớp cơ bản: lớp biên, lớp điều khiển và lớp thực thể.</w:t>
+        <w:t>2.</w:t>
+      </w:r>
+      <w:r>
+        <w:t>3</w:t>
+      </w:r>
+      <w:r>
+        <w:t>. Mô hình trạng thái</w:t>
+      </w:r>
+    </w:p>
+    <w:p>
+      <w:r>
+        <w:t>Mô hình trạng thái mô tả sự thay đổi trạng thái của quá trình đặt hàng từ lúc khách hàng đang chọn sản phẩm đến khi đơn hàng hoàn tất.</w:t>
       </w:r>
     </w:p>
     <w:p>
       <w:r>
         <w:lastRenderedPageBreak/>
-        <w:t>Lớp biên chịu trách nhiệm tiếp nhận thao tác từ khách hàng. Lớp điều khiển thực hiện các quy tắc và điều phối quá trình xử lý. Lớp thực thể đại diện cho các thông tin nghiệp vụ cần quản lý.</w:t>
-      </w:r>
-    </w:p>
-    <w:p>
-      <w:r>
-        <w:t>Các lớp phân tích chính gồm:</w:t>
-      </w:r>
-    </w:p>
-    <w:p>
-      <w:pPr>
-        <w:numPr>
-          <w:ilvl w:val="0"/>
-          <w:numId w:val="33"/>
-        </w:numPr>
-      </w:pPr>
-      <w:r>
-        <w:t>Giao diện mua hàng.</w:t>
-      </w:r>
-    </w:p>
-    <w:p>
-      <w:pPr>
-        <w:numPr>
-          <w:ilvl w:val="0"/>
-          <w:numId w:val="33"/>
-        </w:numPr>
-      </w:pPr>
-      <w:r>
-        <w:t>Giao diện tài khoản.</w:t>
-      </w:r>
-    </w:p>
-    <w:p>
-      <w:pPr>
-        <w:numPr>
-          <w:ilvl w:val="0"/>
-          <w:numId w:val="33"/>
-        </w:numPr>
-      </w:pPr>
-      <w:r>
-        <w:t>Điều khiển mua hàng.</w:t>
-      </w:r>
-    </w:p>
-    <w:p>
-      <w:pPr>
-        <w:numPr>
-          <w:ilvl w:val="0"/>
-          <w:numId w:val="33"/>
-        </w:numPr>
-      </w:pPr>
-      <w:r>
-        <w:t>Điều khiển tài khoản.</w:t>
-      </w:r>
-    </w:p>
-    <w:p>
-      <w:pPr>
-        <w:numPr>
-          <w:ilvl w:val="0"/>
-          <w:numId w:val="33"/>
-        </w:numPr>
-      </w:pPr>
-      <w:r>
-        <w:t>Sản phẩm.</w:t>
-      </w:r>
-    </w:p>
-    <w:p>
-      <w:pPr>
-        <w:numPr>
-          <w:ilvl w:val="0"/>
-          <w:numId w:val="33"/>
-        </w:numPr>
-      </w:pPr>
-      <w:r>
-        <w:t>Giỏ hàng.</w:t>
-      </w:r>
-    </w:p>
-    <w:p>
-      <w:pPr>
-        <w:numPr>
-          <w:ilvl w:val="0"/>
-          <w:numId w:val="33"/>
-        </w:numPr>
-      </w:pPr>
-      <w:r>
-        <w:t>Khách hàng.</w:t>
-      </w:r>
-    </w:p>
-    <w:p>
-      <w:pPr>
-        <w:numPr>
-          <w:ilvl w:val="0"/>
-          <w:numId w:val="33"/>
-        </w:numPr>
-      </w:pPr>
-      <w:r>
-        <w:t>Đơn hàng.</w:t>
-      </w:r>
-    </w:p>
-    <w:p>
-      <w:r>
-        <w:t>Ngoài ra, mô hình còn thể hiện ba thành phần bên ngoài là hệ thống quản lý sản phẩm, dịch vụ thanh toán trực tuyến và dịch vụ thư điện tử.</w:t>
-      </w:r>
-    </w:p>
-    <w:p>
-      <w:pPr>
-        <w:spacing w:before="240" w:line="360" w:lineRule="auto"/>
-      </w:pPr>
-      <w:r>
-        <w:lastRenderedPageBreak/>
-        <w:drawing>
-          <wp:inline distT="0" distB="0" distL="0" distR="0" wp14:anchorId="6C79DC32" wp14:editId="274DCC85">
-            <wp:extent cx="5972175" cy="4242435"/>
-            <wp:effectExtent l="0" t="0" r="9525" b="5715"/>
-            <wp:docPr id="1160460922" name="Picture 1"/>
-            <wp:cNvGraphicFramePr>
-              <a:graphicFrameLocks xmlns:a="http://schemas.openxmlformats.org/drawingml/2006/main" noChangeAspect="1"/>
-            </wp:cNvGraphicFramePr>
-            <a:graphic xmlns:a="http://schemas.openxmlformats.org/drawingml/2006/main">
-              <a:graphicData uri="http://schemas.openxmlformats.org/drawingml/2006/picture">
-                <pic:pic xmlns:pic="http://schemas.openxmlformats.org/drawingml/2006/picture">
-                  <pic:nvPicPr>
-                    <pic:cNvPr id="1160460922" name=""/>
-                    <pic:cNvPicPr/>
-                  </pic:nvPicPr>
-                  <pic:blipFill>
-                    <a:blip r:embed="rId7"/>
-                    <a:stretch>
-                      <a:fillRect/>
-                    </a:stretch>
-                  </pic:blipFill>
-                  <pic:spPr>
-                    <a:xfrm>
-                      <a:off x="0" y="0"/>
-                      <a:ext cx="5972175" cy="4242435"/>
-                    </a:xfrm>
-                    <a:prstGeom prst="rect">
-                      <a:avLst/>
-                    </a:prstGeom>
-                  </pic:spPr>
-                </pic:pic>
-              </a:graphicData>
-            </a:graphic>
-          </wp:inline>
-        </w:drawing>
-      </w:r>
-    </w:p>
-    <w:p>
-      <w:pPr>
-        <w:jc w:val="center"/>
-        <w:rPr>
-          <w:i/>
-          <w:iCs/>
-        </w:rPr>
-      </w:pPr>
-      <w:r>
-        <w:rPr>
-          <w:i/>
-          <w:iCs/>
-        </w:rPr>
-        <w:t>Hình 2.2. Sơ đồ lớp phân tích của hệ thống e-SHOPPING</w:t>
-      </w:r>
-    </w:p>
-    <w:p>
-      <w:r>
-        <w:t>Giao diện mua hàng tiếp nhận yêu cầu xem sản phẩm, quản lý giỏ hàng và đặt hàng. Các yêu cầu này được chuyển đến lớp Điều khiển mua hàng để xử lý.</w:t>
-      </w:r>
-    </w:p>
-    <w:p>
-      <w:r>
-        <w:t>Giao diện tài khoản tiếp nhận thông tin đăng nhập hoặc đăng ký và chuyển cho lớp Điều khiển tài khoản. Lớp điều khiển này kiểm tra và cập nhật thông tin khách hàng.</w:t>
-      </w:r>
-    </w:p>
-    <w:p>
-      <w:r>
-        <w:t>Điều khiển mua hàng sử dụng các thực thể Sản phẩm, Giỏ hàng và Đơn hàng. Khi cần lấy dữ liệu sản phẩm, xử lý thanh toán hoặc gửi thư, lớp điều khiển gửi yêu cầu đến hệ thống bên ngoài tương ứng.</w:t>
-      </w:r>
-    </w:p>
-    <w:p>
-      <w:r>
-        <w:t>2.4. Mô hình trạng thái</w:t>
-      </w:r>
-    </w:p>
-    <w:p>
-      <w:r>
-        <w:t>Mô hình trạng thái mô tả sự thay đổi trạng thái của quá trình đặt hàng từ lúc khách hàng đang chọn sản phẩm đến khi đơn hàng hoàn tất.</w:t>
-      </w:r>
-    </w:p>
-    <w:p>
-      <w:r>
         <w:t>Các trạng thái chính gồm:</w:t>
       </w:r>
     </w:p>
@@ -3684,7 +3503,6 @@
         </w:numPr>
       </w:pPr>
       <w:r>
-        <w:lastRenderedPageBreak/>
         <w:t>Chờ thông tin đặt hàng.</w:t>
       </w:r>
     </w:p>
@@ -3769,7 +3587,7 @@
                     <pic:cNvPicPr/>
                   </pic:nvPicPr>
                   <pic:blipFill>
-                    <a:blip r:embed="rId8"/>
+                    <a:blip r:embed="rId7"/>
                     <a:stretch>
                       <a:fillRect/>
                     </a:stretch>
@@ -3814,18 +3632,30 @@
     </w:p>
     <w:p>
       <w:r>
-        <w:t>2.5. Mô hình tuần tự</w:t>
-      </w:r>
-    </w:p>
-    <w:p>
-      <w:r>
         <w:lastRenderedPageBreak/>
+        <w:t>2.</w:t>
+      </w:r>
+      <w:r>
+        <w:t>4</w:t>
+      </w:r>
+      <w:r>
+        <w:t>. Mô hình tuần tự</w:t>
+      </w:r>
+    </w:p>
+    <w:p>
+      <w:r>
         <w:t>Mô hình tuần tự được sử dụng để mô tả thứ tự trao đổi thông tin giữa khách hàng, e-SHOPPING và các hệ thống bên ngoài. Hai quy trình được lựa chọn là chọn sản phẩm và đặt hàng.</w:t>
       </w:r>
     </w:p>
     <w:p>
       <w:r>
-        <w:t>2.5.1. Tuần tự chọn sản phẩm và quản lý giỏ hàng</w:t>
+        <w:t>2.</w:t>
+      </w:r>
+      <w:r>
+        <w:t>4</w:t>
+      </w:r>
+      <w:r>
+        <w:t>.1. Tuần tự chọn sản phẩm và quản lý giỏ hàng</w:t>
       </w:r>
     </w:p>
     <w:p>
@@ -3910,7 +3740,7 @@
                     <pic:cNvPicPr/>
                   </pic:nvPicPr>
                   <pic:blipFill>
-                    <a:blip r:embed="rId9"/>
+                    <a:blip r:embed="rId8"/>
                     <a:stretch>
                       <a:fillRect/>
                     </a:stretch>
@@ -3935,186 +3765,167 @@
           <w:i/>
           <w:iCs/>
         </w:rPr>
-        <w:t>Hình 2.4. Sơ đồ tuần tự chọn sản phẩm và quản lý giỏ hàng</w:t>
-      </w:r>
-    </w:p>
-    <w:p>
-      <w:r>
-        <w:t>Khách hàng bắt đầu bằng việc chọn một nhóm sản phẩm. Giao diện chuyển yêu cầu đến bộ phận xử lý mua hàng. Bộ phận xử lý gửi yêu cầu đến hệ thống quản lý sản phẩm để lấy danh sách sản phẩm hiện hành.</w:t>
-      </w:r>
-    </w:p>
-    <w:p>
-      <w:r>
-        <w:lastRenderedPageBreak/>
-        <w:t>Sau khi nhận được dữ liệu, e-SHOPPING hiển thị danh sách cho khách hàng. Khách hàng có thể chọn sản phẩm và số lượng cần mua. Hệ thống thêm sản phẩm vào giỏ hàng, tính lại tiền hàng và hiển thị kết quả.</w:t>
-      </w:r>
-    </w:p>
-    <w:p>
-      <w:r>
-        <w:t>Khi khách hàng thay đổi số lượng hoặc xóa sản phẩm, giỏ hàng được cập nhật và tổng tiền hàng được tính lại.</w:t>
-      </w:r>
-    </w:p>
-    <w:p>
-      <w:r>
-        <w:t>2.5.2. Tuần tự đặt hàng, thanh toán và gửi thư xác nhận</w:t>
-      </w:r>
-    </w:p>
-    <w:p>
-      <w:r>
-        <w:t>Các đối tượng tham gia gồm:</w:t>
-      </w:r>
-    </w:p>
-    <w:p>
-      <w:pPr>
-        <w:numPr>
-          <w:ilvl w:val="0"/>
-          <w:numId w:val="36"/>
-        </w:numPr>
-      </w:pPr>
-      <w:r>
-        <w:t>Khách hàng.</w:t>
-      </w:r>
-    </w:p>
-    <w:p>
-      <w:pPr>
-        <w:numPr>
-          <w:ilvl w:val="0"/>
-          <w:numId w:val="36"/>
-        </w:numPr>
-      </w:pPr>
-      <w:r>
-        <w:t>Giao diện đặt hàng.</w:t>
-      </w:r>
-    </w:p>
-    <w:p>
-      <w:pPr>
-        <w:numPr>
-          <w:ilvl w:val="0"/>
-          <w:numId w:val="36"/>
-        </w:numPr>
-      </w:pPr>
-      <w:r>
-        <w:t>Bộ phận xử lý đặt hàng.</w:t>
-      </w:r>
-    </w:p>
-    <w:p>
-      <w:pPr>
-        <w:numPr>
-          <w:ilvl w:val="0"/>
-          <w:numId w:val="36"/>
-        </w:numPr>
-      </w:pPr>
-      <w:r>
-        <w:t>Hệ thống quản lý sản phẩm.</w:t>
-      </w:r>
-    </w:p>
-    <w:p>
-      <w:pPr>
-        <w:numPr>
-          <w:ilvl w:val="0"/>
-          <w:numId w:val="36"/>
-        </w:numPr>
-      </w:pPr>
-      <w:r>
-        <w:t>Dịch vụ thanh toán trực tuyến.</w:t>
-      </w:r>
-    </w:p>
-    <w:p>
-      <w:pPr>
-        <w:numPr>
-          <w:ilvl w:val="0"/>
-          <w:numId w:val="36"/>
-        </w:numPr>
-      </w:pPr>
-      <w:r>
-        <w:t>Kho dữ liệu đơn hàng.</w:t>
-      </w:r>
-    </w:p>
-    <w:p>
-      <w:pPr>
-        <w:numPr>
-          <w:ilvl w:val="0"/>
-          <w:numId w:val="36"/>
-        </w:numPr>
-      </w:pPr>
-      <w:r>
-        <w:t>Dịch vụ thư điện tử.</w:t>
-      </w:r>
-    </w:p>
-    <w:p>
-      <w:pPr>
-        <w:spacing w:before="240" w:line="360" w:lineRule="auto"/>
-        <w:jc w:val="center"/>
-      </w:pPr>
-      <w:r>
-        <w:drawing>
-          <wp:inline distT="0" distB="0" distL="0" distR="0" wp14:anchorId="49BB00DE" wp14:editId="44ECFAE4">
-            <wp:extent cx="5972175" cy="3524885"/>
-            <wp:effectExtent l="0" t="0" r="9525" b="0"/>
-            <wp:docPr id="435395994" name="Picture 1"/>
-            <wp:cNvGraphicFramePr>
-              <a:graphicFrameLocks xmlns:a="http://schemas.openxmlformats.org/drawingml/2006/main" noChangeAspect="1"/>
-            </wp:cNvGraphicFramePr>
-            <a:graphic xmlns:a="http://schemas.openxmlformats.org/drawingml/2006/main">
-              <a:graphicData uri="http://schemas.openxmlformats.org/drawingml/2006/picture">
-                <pic:pic xmlns:pic="http://schemas.openxmlformats.org/drawingml/2006/picture">
-                  <pic:nvPicPr>
-                    <pic:cNvPr id="435395994" name=""/>
-                    <pic:cNvPicPr/>
-                  </pic:nvPicPr>
-                  <pic:blipFill>
-                    <a:blip r:embed="rId10"/>
-                    <a:stretch>
-                      <a:fillRect/>
-                    </a:stretch>
-                  </pic:blipFill>
-                  <pic:spPr>
-                    <a:xfrm>
-                      <a:off x="0" y="0"/>
-                      <a:ext cx="5972175" cy="3524885"/>
-                    </a:xfrm>
-                    <a:prstGeom prst="rect">
-                      <a:avLst/>
-                    </a:prstGeom>
-                  </pic:spPr>
-                </pic:pic>
-              </a:graphicData>
-            </a:graphic>
-          </wp:inline>
-        </w:drawing>
+        <w:t>Hình 2.4.</w:t>
       </w:r>
       <w:r>
         <w:rPr>
           <w:i/>
           <w:iCs/>
         </w:rPr>
-        <w:t>Hình 2.5. Sơ đồ tuần tự đặt hàng, thanh toán và gửi thư xác nhận</w:t>
+        <w:t>1</w:t>
+      </w:r>
+      <w:r>
+        <w:rPr>
+          <w:i/>
+          <w:iCs/>
+          <w:lang w:val="vi-VN"/>
+        </w:rPr>
+        <w:t xml:space="preserve"> </w:t>
+      </w:r>
+      <w:r>
+        <w:rPr>
+          <w:i/>
+          <w:iCs/>
+        </w:rPr>
+        <w:t xml:space="preserve"> Sơ đồ tuần tự chọn sản phẩm và quản lý giỏ hàng</w:t>
       </w:r>
     </w:p>
     <w:p>
       <w:r>
         <w:lastRenderedPageBreak/>
-        <w:t>Khách hàng chọn chức năng tính tiền, nhập thông tin người nhận và lựa chọn hình thức giao hàng. Hệ thống tính tiền hàng, phí giao hàng và tổng số tiền cần thanh toán.</w:t>
-      </w:r>
-    </w:p>
-    <w:p>
-      <w:r>
-        <w:t>Trước khi thanh toán, bộ phận xử lý đặt hàng kiểm tra lại giá bán và tình trạng hàng thông qua hệ thống quản lý sản phẩm. Nếu dữ liệu sản phẩm đã thay đổi hoặc sản phẩm không còn hàng, khách hàng được yêu cầu cập nhật lại giỏ hàng.</w:t>
-      </w:r>
-    </w:p>
-    <w:p>
-      <w:r>
-        <w:t>Nếu sản phẩm còn hợp lệ, hệ thống gửi yêu cầu đến dịch vụ thanh toán trực tuyến. Khi thanh toán thất bại, đơn hàng hoàn tất không được tạo và khách hàng có thể nhập lại thông tin thanh toán.</w:t>
-      </w:r>
-    </w:p>
-    <w:p>
-      <w:r>
-        <w:t>Khi thanh toán thành công, hệ thống lưu đơn hàng và các chi tiết đơn hàng. Nếu khách hàng có địa chỉ thư điện tử, hệ thống yêu cầu dịch vụ thư điện tử gửi nội dung xác nhận. Cuối cùng, mã đơn hàng được hiển thị cho khách hàng.</w:t>
-      </w:r>
-    </w:p>
-    <w:p>
-      <w:r>
-        <w:t>2.6. Mô hình lớp thiết kế</w:t>
+        <w:t>Khách hàng bắt đầu bằng việc chọn một nhóm sản phẩm. Giao diện chuyển yêu cầu đến bộ phận xử lý mua hàng. Bộ phận xử lý gửi yêu cầu đến hệ thống quản lý sản phẩm để lấy danh sách sản phẩm hiện hành.</w:t>
+      </w:r>
+    </w:p>
+    <w:p>
+      <w:r>
+        <w:t>Sau khi nhận được dữ liệu, e-SHOPPING hiển thị danh sách cho khách hàng. Khách hàng có thể chọn sản phẩm và số lượng cần mua. Hệ thống thêm sản phẩm vào giỏ hàng, tính lại tiền hàng và hiển thị kết quả.</w:t>
+      </w:r>
+    </w:p>
+    <w:p>
+      <w:r>
+        <w:t>Khi khách hàng thay đổi số lượng hoặc xóa sản phẩm, giỏ hàng được cập nhật và tổng tiền hàng được tính lại.</w:t>
+      </w:r>
+    </w:p>
+    <w:p>
+      <w:r>
+        <w:t>2.4.2. Tuần tự đặt hàng, thanh toán và gửi thư xác nhận</w:t>
+      </w:r>
+    </w:p>
+    <w:p>
+      <w:r>
+        <w:t>Sơ đồ gồm 5 đối tượng tham gia:</w:t>
+      </w:r>
+    </w:p>
+    <w:p>
+      <w:pPr>
+        <w:numPr>
+          <w:ilvl w:val="0"/>
+          <w:numId w:val="40"/>
+        </w:numPr>
+      </w:pPr>
+      <w:r>
+        <w:t>Khách hàng — Actor.</w:t>
+      </w:r>
+    </w:p>
+    <w:p>
+      <w:pPr>
+        <w:numPr>
+          <w:ilvl w:val="0"/>
+          <w:numId w:val="40"/>
+        </w:numPr>
+      </w:pPr>
+      <w:r>
+        <w:t>Giao diện đặt hàng — Boundary.</w:t>
+      </w:r>
+    </w:p>
+    <w:p>
+      <w:pPr>
+        <w:numPr>
+          <w:ilvl w:val="0"/>
+          <w:numId w:val="40"/>
+        </w:numPr>
+      </w:pPr>
+      <w:r>
+        <w:t>Xử lý đặt hàng — Control.</w:t>
+      </w:r>
+    </w:p>
+    <w:p>
+      <w:pPr>
+        <w:numPr>
+          <w:ilvl w:val="0"/>
+          <w:numId w:val="40"/>
+        </w:numPr>
+      </w:pPr>
+      <w:r>
+        <w:t>Kho sản phẩm / đơn hàng — Entity, lưu thông tin sản phẩm và đơn hàng.</w:t>
+      </w:r>
+    </w:p>
+    <w:p>
+      <w:pPr>
+        <w:numPr>
+          <w:ilvl w:val="0"/>
+          <w:numId w:val="40"/>
+        </w:numPr>
+      </w:pPr>
+      <w:r>
+        <w:t>Thanh toán / Email — Boundary, đại diện cho các dịch vụ bên ngoài.</w:t>
+      </w:r>
+    </w:p>
+    <w:p>
+      <w:r>
+        <w:rPr>
+          <w:i/>
+          <w:iCs/>
+        </w:rPr>
+        <w:t>Hình 2.4.</w:t>
+      </w:r>
+      <w:r>
+        <w:rPr>
+          <w:i/>
+          <w:iCs/>
+        </w:rPr>
+        <w:t>2</w:t>
+      </w:r>
+      <w:r>
+        <w:rPr>
+          <w:i/>
+          <w:iCs/>
+          <w:lang w:val="vi-VN"/>
+        </w:rPr>
+        <w:t xml:space="preserve"> </w:t>
+      </w:r>
+      <w:r>
+        <w:rPr>
+          <w:i/>
+          <w:iCs/>
+        </w:rPr>
+        <w:t xml:space="preserve"> Sơ đồ tuần tự đặt hàng, thanh toán và gửi thư xác nhận</w:t>
+      </w:r>
+    </w:p>
+    <w:p>
+      <w:r>
+        <w:t>Khách hàng chọn tính tiền, nhập thông tin người nhận và hình thức giao hàng. Giao diện chuyển yêu cầu cho bộ phận xử lý đặt hàng để tính tổng tiền.</w:t>
+      </w:r>
+    </w:p>
+    <w:p>
+      <w:r>
+        <w:t>Trước khi thanh toán, bộ phận xử lý kiểm tra giá và tình trạng hàng trong kho dữ liệu. Nếu sản phẩm không hợp lệ hoặc hết hàng, hệ thống yêu cầu khách hàng cập nhật giỏ hàng. Nếu hợp lệ, khách hàng nhập thông tin thẻ và xác nhận đặt hàng.</w:t>
+      </w:r>
+    </w:p>
+    <w:p>
+      <w:r>
+        <w:t>Bộ phận xử lý gửi yêu cầu đến cổng thanh toán. Nếu thanh toán thất bại, hệ thống không lưu đơn hàng và yêu cầu khách hàng kiểm tra lại thông tin thẻ. Khi thanh toán thành công, hệ thống lưu đơn hàng, nhận mã đơn và yêu cầu gửi thư xác nhận. Cuối cùng, giao diện thông báo kết quả đặt hàng cho khách hàng.</w:t>
+      </w:r>
+    </w:p>
+    <w:p>
+      <w:r>
+        <w:t>2.</w:t>
+      </w:r>
+      <w:r>
+        <w:t>5</w:t>
+      </w:r>
+      <w:r>
+        <w:t>. Mô hình lớp thiết kế</w:t>
       </w:r>
     </w:p>
     <w:p>
@@ -4124,11 +3935,18 @@
     </w:p>
     <w:p>
       <w:r>
-        <w:t>2.6.1. Sơ đồ lớp thiết kế nghiệp vụ</w:t>
-      </w:r>
-    </w:p>
-    <w:p>
-      <w:r>
+        <w:t>2.</w:t>
+      </w:r>
+      <w:r>
+        <w:t>5</w:t>
+      </w:r>
+      <w:r>
+        <w:t>.1. Sơ đồ lớp thiết kế nghiệp vụ</w:t>
+      </w:r>
+    </w:p>
+    <w:p>
+      <w:r>
+        <w:lastRenderedPageBreak/>
         <w:t>Các lớp nghiệp vụ chính gồm:</w:t>
       </w:r>
     </w:p>
@@ -4226,7 +4044,6 @@
         <w:jc w:val="center"/>
       </w:pPr>
       <w:r>
-        <w:lastRenderedPageBreak/>
         <w:drawing>
           <wp:inline distT="0" distB="0" distL="0" distR="0" wp14:anchorId="664DD87C" wp14:editId="71D5541F">
             <wp:extent cx="5972175" cy="3364865"/>
@@ -4243,7 +4060,7 @@
                     <pic:cNvPicPr/>
                   </pic:nvPicPr>
                   <pic:blipFill>
-                    <a:blip r:embed="rId11"/>
+                    <a:blip r:embed="rId9"/>
                     <a:stretch>
                       <a:fillRect/>
                     </a:stretch>
@@ -4278,266 +4095,56 @@
           <w:i/>
           <w:iCs/>
         </w:rPr>
-        <w:t>Hình 2.6. Sơ đồ lớp thiết kế nghiệp vụ của hệ thống e-SHOPPING</w:t>
-      </w:r>
-    </w:p>
-    <w:p>
-      <w:r>
-        <w:t>Một giỏ hàng gồm nhiều mục giỏ hàng. Mỗi mục giỏ hàng tham chiếu đến một sản phẩm và lưu số lượng khách hàng muốn mua.</w:t>
-      </w:r>
-    </w:p>
-    <w:p>
-      <w:r>
-        <w:t>Một khách hàng có thể đặt nhiều đơn hàng. Mỗi đơn hàng có một người nhận và gồm nhiều chi tiết đơn hàng. Chi tiết đơn hàng lưu sản phẩm, số lượng và đơn giá tại thời điểm đặt.</w:t>
-      </w:r>
-    </w:p>
-    <w:p>
-      <w:r>
-        <w:t>Đơn giá phải được lưu trong chi tiết đơn hàng vì giá hiện hành của sản phẩm có thể thay đổi sau khi đơn hàng được tạo.</w:t>
-      </w:r>
-    </w:p>
-    <w:p>
-      <w:r>
-        <w:t>Mỗi đơn hàng gắn với một giao dịch thanh toán. Giao dịch thanh toán chỉ lưu những thông tin cần thiết như mã giao dịch, loại thẻ, bốn số cuối của thẻ và trạng thái thanh toán. Số thẻ đầy đủ và mã bảo mật không được lưu vào cơ sở dữ liệu.</w:t>
-      </w:r>
-    </w:p>
-    <w:p>
-      <w:r>
-        <w:t>2.6.2. Sơ đồ lớp thiết kế kỹ thuật</w:t>
-      </w:r>
-    </w:p>
-    <w:p>
-      <w:r>
-        <w:t>Sơ đồ lớp kỹ thuật được tổ chức thành ba nhóm:</w:t>
-      </w:r>
-    </w:p>
-    <w:p>
-      <w:pPr>
-        <w:numPr>
-          <w:ilvl w:val="0"/>
-          <w:numId w:val="38"/>
-        </w:numPr>
-      </w:pPr>
-      <w:r>
-        <w:t>Nhóm giao diện.</w:t>
-      </w:r>
-    </w:p>
-    <w:p>
-      <w:pPr>
-        <w:numPr>
-          <w:ilvl w:val="0"/>
-          <w:numId w:val="38"/>
-        </w:numPr>
-      </w:pPr>
-      <w:r>
-        <w:t>Nhóm xử lý nghiệp vụ.</w:t>
-      </w:r>
-    </w:p>
-    <w:p>
-      <w:pPr>
-        <w:numPr>
-          <w:ilvl w:val="0"/>
-          <w:numId w:val="38"/>
-        </w:numPr>
-      </w:pPr>
-      <w:r>
-        <w:t>Nhóm kết nối và truy cập dữ liệu.</w:t>
-      </w:r>
-    </w:p>
-    <w:p>
-      <w:pPr>
-        <w:spacing w:before="240" w:line="360" w:lineRule="auto"/>
-        <w:jc w:val="center"/>
-      </w:pPr>
-      <w:r>
-        <w:lastRenderedPageBreak/>
-        <w:drawing>
-          <wp:inline distT="0" distB="0" distL="0" distR="0" wp14:anchorId="5408DB0D" wp14:editId="6AB27699">
-            <wp:extent cx="5972175" cy="2942590"/>
-            <wp:effectExtent l="0" t="0" r="9525" b="0"/>
-            <wp:docPr id="1812438686" name="Picture 1"/>
-            <wp:cNvGraphicFramePr>
-              <a:graphicFrameLocks xmlns:a="http://schemas.openxmlformats.org/drawingml/2006/main" noChangeAspect="1"/>
-            </wp:cNvGraphicFramePr>
-            <a:graphic xmlns:a="http://schemas.openxmlformats.org/drawingml/2006/main">
-              <a:graphicData uri="http://schemas.openxmlformats.org/drawingml/2006/picture">
-                <pic:pic xmlns:pic="http://schemas.openxmlformats.org/drawingml/2006/picture">
-                  <pic:nvPicPr>
-                    <pic:cNvPr id="1812438686" name=""/>
-                    <pic:cNvPicPr/>
-                  </pic:nvPicPr>
-                  <pic:blipFill>
-                    <a:blip r:embed="rId12"/>
-                    <a:stretch>
-                      <a:fillRect/>
-                    </a:stretch>
-                  </pic:blipFill>
-                  <pic:spPr>
-                    <a:xfrm>
-                      <a:off x="0" y="0"/>
-                      <a:ext cx="5972175" cy="2942590"/>
-                    </a:xfrm>
-                    <a:prstGeom prst="rect">
-                      <a:avLst/>
-                    </a:prstGeom>
-                  </pic:spPr>
-                </pic:pic>
-              </a:graphicData>
-            </a:graphic>
-          </wp:inline>
-        </w:drawing>
+        <w:t>Hình 2.</w:t>
       </w:r>
       <w:r>
         <w:rPr>
           <w:i/>
           <w:iCs/>
         </w:rPr>
-        <w:t>Hình 2.7. Sơ đồ lớp thiết kế kỹ thuật của hệ thống e-SHOPPING</w:t>
-      </w:r>
-    </w:p>
-    <w:p>
-      <w:r>
-        <w:t>Nhóm giao diện gồm Giao diện mua hàng và Giao diện tài khoản. Các giao diện chỉ tiếp nhận dữ liệu và hiển thị kết quả, không tự xử lý nghiệp vụ hoặc truy cập trực tiếp cơ sở dữ liệu.</w:t>
-      </w:r>
-    </w:p>
-    <w:p>
-      <w:r>
-        <w:t>Nhóm xử lý nghiệp vụ gồm Xử lý sản phẩm, Xử lý giỏ hàng, Xử lý đặt hàng và Xử lý tài khoản. Đây là nơi thực hiện các quy tắc như tính tiền hàng, tính phí giao hàng, kiểm tra điều kiện miễn phí giao hàng và ghi nhận đơn hàng.</w:t>
-      </w:r>
-    </w:p>
-    <w:p>
-      <w:r>
-        <w:t>Nhóm kết nối gồm Kết nối quản lý sản phẩm, Kết nối thanh toán và Kết nối thư điện tử. Mỗi lớp kết nối chỉ phụ trách trao đổi dữ liệu với một hệ thống bên ngoài.</w:t>
-      </w:r>
-    </w:p>
-    <w:p>
-      <w:r>
-        <w:t>Lớp Truy cập cơ sở dữ liệu thực hiện việc đọc và ghi dữ liệu khách hàng, đơn hàng và chi tiết đơn hàng. Cách tổ chức này giúp giao diện, nghiệp vụ và dữ liệu không phụ thuộc trực tiếp vào nhau.</w:t>
-      </w:r>
-    </w:p>
-    <w:p>
-      <w:r>
-        <w:t>2.7. Thiết kế theo chức năng</w:t>
-      </w:r>
-    </w:p>
-    <w:p>
-      <w:r>
-        <w:t>Mô hình thiết kế theo chức năng thể hiện cách các nhóm chức năng của e-SHOPPING được tổ chức trong chương trình.</w:t>
-      </w:r>
-    </w:p>
-    <w:p>
-      <w:r>
-        <w:t>Các chức năng giao diện gồm:</w:t>
-      </w:r>
-    </w:p>
-    <w:p>
-      <w:pPr>
-        <w:numPr>
-          <w:ilvl w:val="0"/>
-          <w:numId w:val="39"/>
-        </w:numPr>
-      </w:pPr>
-      <w:r>
-        <w:t>Xem sản phẩm.</w:t>
-      </w:r>
-    </w:p>
-    <w:p>
-      <w:pPr>
-        <w:numPr>
-          <w:ilvl w:val="0"/>
-          <w:numId w:val="39"/>
-        </w:numPr>
-      </w:pPr>
-      <w:r>
-        <w:t>Quản lý giỏ hàng.</w:t>
-      </w:r>
-    </w:p>
-    <w:p>
-      <w:pPr>
-        <w:numPr>
-          <w:ilvl w:val="0"/>
-          <w:numId w:val="39"/>
-        </w:numPr>
-      </w:pPr>
-      <w:r>
-        <w:t>Đăng nhập và đăng ký.</w:t>
-      </w:r>
-    </w:p>
-    <w:p>
-      <w:pPr>
-        <w:numPr>
-          <w:ilvl w:val="0"/>
-          <w:numId w:val="39"/>
-        </w:numPr>
-      </w:pPr>
-      <w:r>
-        <w:lastRenderedPageBreak/>
-        <w:t>Đặt hàng.</w:t>
-      </w:r>
-    </w:p>
-    <w:p>
-      <w:r>
-        <w:t>Mỗi chức năng giao diện được chuyển đến bộ phận xử lý nghiệp vụ tương ứng. Bộ phận xử lý nghiệp vụ sử dụng lớp kết nối hoặc lớp truy cập dữ liệu khi cần thiết.</w:t>
-      </w:r>
-    </w:p>
-    <w:p>
-      <w:pPr>
-        <w:spacing w:before="240" w:line="360" w:lineRule="auto"/>
-        <w:jc w:val="center"/>
-      </w:pPr>
-      <w:r>
-        <w:drawing>
-          <wp:inline distT="0" distB="0" distL="0" distR="0" wp14:anchorId="3D7B60DA" wp14:editId="3D08293C">
-            <wp:extent cx="5972175" cy="3230880"/>
-            <wp:effectExtent l="0" t="0" r="9525" b="7620"/>
-            <wp:docPr id="430182052" name="Picture 1"/>
-            <wp:cNvGraphicFramePr>
-              <a:graphicFrameLocks xmlns:a="http://schemas.openxmlformats.org/drawingml/2006/main" noChangeAspect="1"/>
-            </wp:cNvGraphicFramePr>
-            <a:graphic xmlns:a="http://schemas.openxmlformats.org/drawingml/2006/main">
-              <a:graphicData uri="http://schemas.openxmlformats.org/drawingml/2006/picture">
-                <pic:pic xmlns:pic="http://schemas.openxmlformats.org/drawingml/2006/picture">
-                  <pic:nvPicPr>
-                    <pic:cNvPr id="430182052" name=""/>
-                    <pic:cNvPicPr/>
-                  </pic:nvPicPr>
-                  <pic:blipFill>
-                    <a:blip r:embed="rId13"/>
-                    <a:stretch>
-                      <a:fillRect/>
-                    </a:stretch>
-                  </pic:blipFill>
-                  <pic:spPr>
-                    <a:xfrm>
-                      <a:off x="0" y="0"/>
-                      <a:ext cx="5972175" cy="3230880"/>
-                    </a:xfrm>
-                    <a:prstGeom prst="rect">
-                      <a:avLst/>
-                    </a:prstGeom>
-                  </pic:spPr>
-                </pic:pic>
-              </a:graphicData>
-            </a:graphic>
-          </wp:inline>
-        </w:drawing>
-      </w:r>
-    </w:p>
-    <w:p>
-      <w:pPr>
-        <w:spacing w:line="276" w:lineRule="auto"/>
-        <w:jc w:val="center"/>
+        <w:t>5</w:t>
+      </w:r>
+      <w:r>
         <w:rPr>
           <w:i/>
           <w:iCs/>
         </w:rPr>
-      </w:pPr>
+        <w:t>.</w:t>
+      </w:r>
       <w:r>
         <w:rPr>
           <w:i/>
           <w:iCs/>
         </w:rPr>
-        <w:t>Hình 2.8. Sơ đồ thiết kế theo chức năng của hệ thống e-SHOPPING</w:t>
+        <w:t>1</w:t>
+      </w:r>
+      <w:r>
+        <w:rPr>
+          <w:i/>
+          <w:iCs/>
+        </w:rPr>
+        <w:t xml:space="preserve"> Sơ đồ lớp thiết kế nghiệp vụ của hệ thống e-SHOPPING</w:t>
+      </w:r>
+    </w:p>
+    <w:p>
+      <w:r>
+        <w:t>Một giỏ hàng gồm nhiều mục giỏ hàng. Mỗi mục giỏ hàng tham chiếu đến một sản phẩm và lưu số lượng khách hàng muốn mua.</w:t>
+      </w:r>
+    </w:p>
+    <w:p>
+      <w:r>
+        <w:t>Một khách hàng có thể đặt nhiều đơn hàng. Mỗi đơn hàng có một người nhận và gồm nhiều chi tiết đơn hàng. Chi tiết đơn hàng lưu sản phẩm, số lượng và đơn giá tại thời điểm đặt.</w:t>
+      </w:r>
+    </w:p>
+    <w:p>
+      <w:r>
+        <w:lastRenderedPageBreak/>
+        <w:t>Đơn giá phải được lưu trong chi tiết đơn hàng vì giá hiện hành của sản phẩm có thể thay đổi sau khi đơn hàng được tạo.</w:t>
+      </w:r>
+    </w:p>
+    <w:p>
+      <w:r>
+        <w:t>Mỗi đơn hàng gắn với một giao dịch thanh toán. Giao dịch thanh toán chỉ lưu những thông tin cần thiết như mã giao dịch, loại thẻ, bốn số cuối của thẻ và trạng thái thanh toán. Số thẻ đầy đủ và mã bảo mật không được lưu vào cơ sở dữ liệu.</w:t>
       </w:r>
     </w:p>
     <w:p>
@@ -4562,7 +4169,13 @@
     </w:p>
     <w:p>
       <w:r>
-        <w:t>2.8. Mô hình hoạt động</w:t>
+        <w:t>2.</w:t>
+      </w:r>
+      <w:r>
+        <w:t>6</w:t>
+      </w:r>
+      <w:r>
+        <w:t>. Mô hình hoạt động</w:t>
       </w:r>
     </w:p>
     <w:p>
@@ -4596,7 +4209,7 @@
                     <pic:cNvPicPr/>
                   </pic:nvPicPr>
                   <pic:blipFill>
-                    <a:blip r:embed="rId14"/>
+                    <a:blip r:embed="rId10"/>
                     <a:stretch>
                       <a:fillRect/>
                     </a:stretch>
@@ -4621,38 +4234,116 @@
       <w:pPr>
         <w:spacing w:line="276" w:lineRule="auto"/>
         <w:jc w:val="center"/>
-      </w:pPr>
-      <w:r>
-        <w:t>Hình 2.9. Sơ đồ hoạt động đặt hàng của hệ thống e-SHOPPING</w:t>
-      </w:r>
-    </w:p>
-    <w:p>
-      <w:r>
+        <w:rPr>
+          <w:lang w:val="vi-VN"/>
+        </w:rPr>
+      </w:pPr>
+      <w:r>
+        <w:rPr>
+          <w:lang w:val="vi-VN"/>
+        </w:rPr>
+        <w:t>Hình 2.</w:t>
+      </w:r>
+      <w:r>
+        <w:rPr>
+          <w:lang w:val="vi-VN"/>
+        </w:rPr>
+        <w:t>6</w:t>
+      </w:r>
+      <w:r>
+        <w:rPr>
+          <w:lang w:val="vi-VN"/>
+        </w:rPr>
+        <w:t>. Sơ đồ hoạt động đặt hàng của hệ thống e-SHOPPING</w:t>
+      </w:r>
+    </w:p>
+    <w:p>
+      <w:pPr>
+        <w:rPr>
+          <w:lang w:val="vi-VN"/>
+        </w:rPr>
+      </w:pPr>
+      <w:r>
+        <w:rPr>
+          <w:lang w:val="vi-VN"/>
+        </w:rPr>
         <w:t>Quy trình bắt đầu khi khách hàng xem và chọn sản phẩm. Các sản phẩm được thêm vào giỏ hàng và khách hàng có thể thay đổi số lượng trước khi tính tiền.</w:t>
       </w:r>
     </w:p>
     <w:p>
-      <w:r>
+      <w:pPr>
+        <w:rPr>
+          <w:lang w:val="vi-VN"/>
+        </w:rPr>
+      </w:pPr>
+      <w:r>
+        <w:rPr>
+          <w:lang w:val="vi-VN"/>
+        </w:rPr>
         <w:t>Nếu chưa đăng nhập, khách hàng phải đăng nhập hoặc đăng ký tài khoản. Sau khi tài khoản hợp lệ, khách hàng nhập thông tin người nhận, chọn hình thức giao hàng và xem tổng số tiền cần thanh toán.</w:t>
       </w:r>
     </w:p>
     <w:p>
-      <w:r>
+      <w:pPr>
+        <w:rPr>
+          <w:lang w:val="vi-VN"/>
+        </w:rPr>
+      </w:pPr>
+      <w:r>
+        <w:rPr>
+          <w:lang w:val="vi-VN"/>
+        </w:rPr>
         <w:t>Khách hàng nhập thông tin thẻ và xác nhận giao dịch. Nếu thanh toán thất bại, hệ thống thông báo lỗi và cho phép nhập lại. Nếu thanh toán thành công, hệ thống lưu đơn hàng.</w:t>
       </w:r>
     </w:p>
     <w:p>
-      <w:r>
+      <w:pPr>
+        <w:rPr>
+          <w:lang w:val="vi-VN"/>
+        </w:rPr>
+      </w:pPr>
+      <w:r>
+        <w:rPr>
+          <w:lang w:val="vi-VN"/>
+        </w:rPr>
         <w:t>Sau khi đơn hàng được lưu, hệ thống yêu cầu gửi thư xác nhận nếu khách hàng có địa chỉ thư điện tử. Quy trình kết thúc khi hệ thống thông báo đặt hàng thành công.</w:t>
       </w:r>
     </w:p>
     <w:p>
-      <w:r>
-        <w:t>2.9. Đối chiếu giữa các mô hình</w:t>
-      </w:r>
-    </w:p>
-    <w:p>
-      <w:r>
+      <w:pPr>
+        <w:rPr>
+          <w:lang w:val="vi-VN"/>
+        </w:rPr>
+      </w:pPr>
+      <w:r>
+        <w:rPr>
+          <w:lang w:val="vi-VN"/>
+        </w:rPr>
+        <w:t>2.</w:t>
+      </w:r>
+      <w:r>
+        <w:rPr>
+          <w:lang w:val="vi-VN"/>
+        </w:rPr>
+        <w:t>7</w:t>
+      </w:r>
+      <w:r>
+        <w:rPr>
+          <w:lang w:val="vi-VN"/>
+        </w:rPr>
+        <w:t>. Đối chiếu giữa các mô hình</w:t>
+      </w:r>
+    </w:p>
+    <w:p>
+      <w:pPr>
+        <w:rPr>
+          <w:lang w:val="vi-VN"/>
+        </w:rPr>
+      </w:pPr>
+      <w:r>
+        <w:rPr>
+          <w:lang w:val="vi-VN"/>
+        </w:rPr>
         <w:lastRenderedPageBreak/>
         <w:t>Bảng 2.3. Đối chiếu nghiệp vụ giữa các mô hình UML</w:t>
       </w:r>
@@ -10277,6 +9968,155 @@
     </w:lvl>
   </w:abstractNum>
   <w:abstractNum w:abstractNumId="37" w15:restartNumberingAfterBreak="0">
+    <w:nsid w:val="7A030B6F"/>
+    <w:multiLevelType w:val="multilevel"/>
+    <w:tmpl w:val="83FE35EA"/>
+    <w:lvl w:ilvl="0">
+      <w:start w:val="1"/>
+      <w:numFmt w:val="bullet"/>
+      <w:lvlText w:val=""/>
+      <w:lvlJc w:val="left"/>
+      <w:pPr>
+        <w:tabs>
+          <w:tab w:val="num" w:pos="720"/>
+        </w:tabs>
+        <w:ind w:left="720" w:hanging="360"/>
+      </w:pPr>
+      <w:rPr>
+        <w:rFonts w:ascii="Symbol" w:hAnsi="Symbol" w:hint="default"/>
+        <w:sz w:val="20"/>
+      </w:rPr>
+    </w:lvl>
+    <w:lvl w:ilvl="1" w:tentative="1">
+      <w:start w:val="1"/>
+      <w:numFmt w:val="bullet"/>
+      <w:lvlText w:val="o"/>
+      <w:lvlJc w:val="left"/>
+      <w:pPr>
+        <w:tabs>
+          <w:tab w:val="num" w:pos="1440"/>
+        </w:tabs>
+        <w:ind w:left="1440" w:hanging="360"/>
+      </w:pPr>
+      <w:rPr>
+        <w:rFonts w:ascii="Courier New" w:hAnsi="Courier New" w:hint="default"/>
+        <w:sz w:val="20"/>
+      </w:rPr>
+    </w:lvl>
+    <w:lvl w:ilvl="2" w:tentative="1">
+      <w:start w:val="1"/>
+      <w:numFmt w:val="bullet"/>
+      <w:lvlText w:val=""/>
+      <w:lvlJc w:val="left"/>
+      <w:pPr>
+        <w:tabs>
+          <w:tab w:val="num" w:pos="2160"/>
+        </w:tabs>
+        <w:ind w:left="2160" w:hanging="360"/>
+      </w:pPr>
+      <w:rPr>
+        <w:rFonts w:ascii="Wingdings" w:hAnsi="Wingdings" w:hint="default"/>
+        <w:sz w:val="20"/>
+      </w:rPr>
+    </w:lvl>
+    <w:lvl w:ilvl="3" w:tentative="1">
+      <w:start w:val="1"/>
+      <w:numFmt w:val="bullet"/>
+      <w:lvlText w:val=""/>
+      <w:lvlJc w:val="left"/>
+      <w:pPr>
+        <w:tabs>
+          <w:tab w:val="num" w:pos="2880"/>
+        </w:tabs>
+        <w:ind w:left="2880" w:hanging="360"/>
+      </w:pPr>
+      <w:rPr>
+        <w:rFonts w:ascii="Wingdings" w:hAnsi="Wingdings" w:hint="default"/>
+        <w:sz w:val="20"/>
+      </w:rPr>
+    </w:lvl>
+    <w:lvl w:ilvl="4" w:tentative="1">
+      <w:start w:val="1"/>
+      <w:numFmt w:val="bullet"/>
+      <w:lvlText w:val=""/>
+      <w:lvlJc w:val="left"/>
+      <w:pPr>
+        <w:tabs>
+          <w:tab w:val="num" w:pos="3600"/>
+        </w:tabs>
+        <w:ind w:left="3600" w:hanging="360"/>
+      </w:pPr>
+      <w:rPr>
+        <w:rFonts w:ascii="Wingdings" w:hAnsi="Wingdings" w:hint="default"/>
+        <w:sz w:val="20"/>
+      </w:rPr>
+    </w:lvl>
+    <w:lvl w:ilvl="5" w:tentative="1">
+      <w:start w:val="1"/>
+      <w:numFmt w:val="bullet"/>
+      <w:lvlText w:val=""/>
+      <w:lvlJc w:val="left"/>
+      <w:pPr>
+        <w:tabs>
+          <w:tab w:val="num" w:pos="4320"/>
+        </w:tabs>
+        <w:ind w:left="4320" w:hanging="360"/>
+      </w:pPr>
+      <w:rPr>
+        <w:rFonts w:ascii="Wingdings" w:hAnsi="Wingdings" w:hint="default"/>
+        <w:sz w:val="20"/>
+      </w:rPr>
+    </w:lvl>
+    <w:lvl w:ilvl="6" w:tentative="1">
+      <w:start w:val="1"/>
+      <w:numFmt w:val="bullet"/>
+      <w:lvlText w:val=""/>
+      <w:lvlJc w:val="left"/>
+      <w:pPr>
+        <w:tabs>
+          <w:tab w:val="num" w:pos="5040"/>
+        </w:tabs>
+        <w:ind w:left="5040" w:hanging="360"/>
+      </w:pPr>
+      <w:rPr>
+        <w:rFonts w:ascii="Wingdings" w:hAnsi="Wingdings" w:hint="default"/>
+        <w:sz w:val="20"/>
+      </w:rPr>
+    </w:lvl>
+    <w:lvl w:ilvl="7" w:tentative="1">
+      <w:start w:val="1"/>
+      <w:numFmt w:val="bullet"/>
+      <w:lvlText w:val=""/>
+      <w:lvlJc w:val="left"/>
+      <w:pPr>
+        <w:tabs>
+          <w:tab w:val="num" w:pos="5760"/>
+        </w:tabs>
+        <w:ind w:left="5760" w:hanging="360"/>
+      </w:pPr>
+      <w:rPr>
+        <w:rFonts w:ascii="Wingdings" w:hAnsi="Wingdings" w:hint="default"/>
+        <w:sz w:val="20"/>
+      </w:rPr>
+    </w:lvl>
+    <w:lvl w:ilvl="8" w:tentative="1">
+      <w:start w:val="1"/>
+      <w:numFmt w:val="bullet"/>
+      <w:lvlText w:val=""/>
+      <w:lvlJc w:val="left"/>
+      <w:pPr>
+        <w:tabs>
+          <w:tab w:val="num" w:pos="6480"/>
+        </w:tabs>
+        <w:ind w:left="6480" w:hanging="360"/>
+      </w:pPr>
+      <w:rPr>
+        <w:rFonts w:ascii="Wingdings" w:hAnsi="Wingdings" w:hint="default"/>
+        <w:sz w:val="20"/>
+      </w:rPr>
+    </w:lvl>
+  </w:abstractNum>
+  <w:abstractNum w:abstractNumId="38" w15:restartNumberingAfterBreak="0">
     <w:nsid w:val="7AE20851"/>
     <w:multiLevelType w:val="multilevel"/>
     <w:tmpl w:val="71B81188"/>
@@ -10425,7 +10265,7 @@
       </w:rPr>
     </w:lvl>
   </w:abstractNum>
-  <w:abstractNum w:abstractNumId="38" w15:restartNumberingAfterBreak="0">
+  <w:abstractNum w:abstractNumId="39" w15:restartNumberingAfterBreak="0">
     <w:nsid w:val="7D563329"/>
     <w:multiLevelType w:val="multilevel"/>
     <w:tmpl w:val="DD2C6786"/>
@@ -10611,7 +10451,7 @@
     <w:abstractNumId w:val="0"/>
   </w:num>
   <w:num w:numId="13" w16cid:durableId="280191814">
-    <w:abstractNumId w:val="38"/>
+    <w:abstractNumId w:val="39"/>
   </w:num>
   <w:num w:numId="14" w16cid:durableId="697125468">
     <w:abstractNumId w:val="14"/>
@@ -10689,6 +10529,9 @@
     <w:abstractNumId w:val="24"/>
   </w:num>
   <w:num w:numId="39" w16cid:durableId="1801875354">
+    <w:abstractNumId w:val="38"/>
+  </w:num>
+  <w:num w:numId="40" w16cid:durableId="1408071867">
     <w:abstractNumId w:val="37"/>
   </w:num>
 </w:numbering>
@@ -11298,7 +11141,6 @@
   <w:style w:type="character" w:default="1" w:styleId="DefaultParagraphFont">
     <w:name w:val="Default Paragraph Font"/>
     <w:uiPriority w:val="1"/>
-    <w:semiHidden/>
     <w:unhideWhenUsed/>
   </w:style>
   <w:style w:type="table" w:default="1" w:styleId="TableNormal">

</xml_diff>